<commit_message>
Add table of contents page to the Assignment SHRM report docx
</commit_message>
<xml_diff>
--- a/Ijaz_DPHP_StudentID_IBMTalentMgmt_Report.docx
+++ b/Ijaz_DPHP_StudentID_IBMTalentMgmt_Report.docx
@@ -61,6 +61,305 @@
           <w:sz w:val="24"/>
         </w:rPr>
         <w:t>This analytical report evaluates the strategic implementation and organizational impact of IBM’s Workforce Management Initiative (WMI) as it evolved from 2003 through 2009. Framed around CEO Sam Palmisano’s vision of the Globally Integrated Enterprise (GIE) and championed by HR leader Randy MacDonald, the WMI represented a pioneering shift from a traditional, country-siloed human resource structure to a standardized, data-driven, and globally integrated talent supply chain. The report provides a comprehensive analysis across three core dimensions. First, it traces the historical and strategic context of IBM's crisis of low talent utilization, service delivery bottlenecks, and fragmented talent pools that motivated a US$100 million initial investment. Second, it examines the technical design of IBM’s Expertise Taxonomy, detailing its hierarchical structure from Primary Job Categories to specific skills, and assesses its governance mechanism. Third, the report evaluates the organizational restructuring of the HR function itself, including the innovative 'dual-hatting' model that integrated functional leadership with business-unit partnership. A detailed stakeholder analysis explores the complex, competing interests of senior executives, line managers, full-time employees, contractors, and external vendors. Ultimately, the report presents a balanced critique of the WMI’s impressive financial and operational returns—such as US$1.5 billion in business benefits and a nine percentage-point increase in billable utilization—against critical concerns regarding worker commoditization, data privacy, and the dilution of the human element in employee relations. The analysis concludes with an evidence-based policy recommendation outlining the necessary organizational, technological, and cultural conditions under which other multinational enterprises can adapt or replicate this global talent management model.</w:t>
+      </w:r>
+    </w:p>
+    <w:p>
+      <w:r>
+        <w:br w:type="page"/>
+      </w:r>
+    </w:p>
+    <w:p>
+      <w:pPr>
+        <w:spacing w:before="240" w:after="360"/>
+        <w:jc w:val="center"/>
+      </w:pPr>
+      <w:r>
+        <w:rPr>
+          <w:rFonts w:ascii="Times New Roman" w:hAnsi="Times New Roman"/>
+          <w:b/>
+          <w:sz w:val="28"/>
+        </w:rPr>
+        <w:t>TABLE OF CONTENTS</w:t>
+      </w:r>
+    </w:p>
+    <w:p>
+      <w:pPr>
+        <w:tabs>
+          <w:tab w:pos="9026" w:val="right"/>
+        </w:tabs>
+        <w:spacing w:after="240"/>
+      </w:pPr>
+      <w:r>
+        <w:rPr>
+          <w:rFonts w:ascii="Times New Roman" w:hAnsi="Times New Roman"/>
+          <w:b/>
+          <w:sz w:val="22"/>
+        </w:rPr>
+        <w:t>Section</w:t>
+      </w:r>
+      <w:r>
+        <w:rPr>
+          <w:rFonts w:ascii="Times New Roman" w:hAnsi="Times New Roman"/>
+          <w:b/>
+          <w:sz w:val="22"/>
+        </w:rPr>
+        <w:tab/>
+        <w:t>Page</w:t>
+      </w:r>
+    </w:p>
+    <w:p>
+      <w:pPr>
+        <w:tabs>
+          <w:tab w:pos="9026" w:val="right" w:leader="dot"/>
+        </w:tabs>
+        <w:spacing w:line="312" w:lineRule="auto" w:after="120"/>
+      </w:pPr>
+      <w:r>
+        <w:rPr>
+          <w:rFonts w:ascii="Times New Roman" w:hAnsi="Times New Roman"/>
+          <w:b/>
+          <w:sz w:val="22"/>
+        </w:rPr>
+        <w:t>Executive Summary</w:t>
+      </w:r>
+      <w:r>
+        <w:rPr>
+          <w:rFonts w:ascii="Times New Roman" w:hAnsi="Times New Roman"/>
+          <w:b/>
+          <w:sz w:val="22"/>
+        </w:rPr>
+        <w:tab/>
+        <w:t>1</w:t>
+      </w:r>
+    </w:p>
+    <w:p>
+      <w:pPr>
+        <w:tabs>
+          <w:tab w:pos="9026" w:val="right" w:leader="dot"/>
+        </w:tabs>
+        <w:spacing w:line="312" w:lineRule="auto" w:after="120"/>
+      </w:pPr>
+      <w:r>
+        <w:rPr>
+          <w:rFonts w:ascii="Times New Roman" w:hAnsi="Times New Roman"/>
+          <w:b/>
+          <w:sz w:val="22"/>
+        </w:rPr>
+        <w:t>Table of Contents</w:t>
+      </w:r>
+      <w:r>
+        <w:rPr>
+          <w:rFonts w:ascii="Times New Roman" w:hAnsi="Times New Roman"/>
+          <w:b/>
+          <w:sz w:val="22"/>
+        </w:rPr>
+        <w:tab/>
+        <w:t>2</w:t>
+      </w:r>
+    </w:p>
+    <w:p>
+      <w:pPr>
+        <w:tabs>
+          <w:tab w:pos="9026" w:val="right" w:leader="dot"/>
+        </w:tabs>
+        <w:spacing w:line="312" w:lineRule="auto" w:after="120"/>
+      </w:pPr>
+      <w:r>
+        <w:rPr>
+          <w:rFonts w:ascii="Times New Roman" w:hAnsi="Times New Roman"/>
+          <w:b/>
+          <w:sz w:val="22"/>
+        </w:rPr>
+        <w:t>1. Introduction</w:t>
+      </w:r>
+      <w:r>
+        <w:rPr>
+          <w:rFonts w:ascii="Times New Roman" w:hAnsi="Times New Roman"/>
+          <w:b/>
+          <w:sz w:val="22"/>
+        </w:rPr>
+        <w:tab/>
+        <w:t>3</w:t>
+      </w:r>
+    </w:p>
+    <w:p>
+      <w:pPr>
+        <w:tabs>
+          <w:tab w:pos="9026" w:val="right" w:leader="dot"/>
+        </w:tabs>
+        <w:spacing w:line="312" w:lineRule="auto" w:after="120"/>
+      </w:pPr>
+      <w:r>
+        <w:rPr>
+          <w:rFonts w:ascii="Times New Roman" w:hAnsi="Times New Roman"/>
+          <w:b/>
+          <w:sz w:val="22"/>
+        </w:rPr>
+        <w:t>2. Strategic &amp; Historical Analysis</w:t>
+      </w:r>
+      <w:r>
+        <w:rPr>
+          <w:rFonts w:ascii="Times New Roman" w:hAnsi="Times New Roman"/>
+          <w:b/>
+          <w:sz w:val="22"/>
+        </w:rPr>
+        <w:tab/>
+        <w:t>3</w:t>
+      </w:r>
+    </w:p>
+    <w:p>
+      <w:pPr>
+        <w:tabs>
+          <w:tab w:pos="9026" w:val="right" w:leader="dot"/>
+        </w:tabs>
+        <w:spacing w:line="312" w:lineRule="auto" w:after="120"/>
+      </w:pPr>
+      <w:r>
+        <w:rPr>
+          <w:rFonts w:ascii="Times New Roman" w:hAnsi="Times New Roman"/>
+          <w:b/>
+          <w:sz w:val="22"/>
+        </w:rPr>
+        <w:t>3. System Design &amp; Implementation</w:t>
+      </w:r>
+      <w:r>
+        <w:rPr>
+          <w:rFonts w:ascii="Times New Roman" w:hAnsi="Times New Roman"/>
+          <w:b/>
+          <w:sz w:val="22"/>
+        </w:rPr>
+        <w:tab/>
+        <w:t>5</w:t>
+      </w:r>
+    </w:p>
+    <w:p>
+      <w:pPr>
+        <w:tabs>
+          <w:tab w:pos="9026" w:val="right" w:leader="dot"/>
+        </w:tabs>
+        <w:spacing w:line="312" w:lineRule="auto" w:after="120"/>
+      </w:pPr>
+      <w:r>
+        <w:rPr>
+          <w:rFonts w:ascii="Times New Roman" w:hAnsi="Times New Roman"/>
+          <w:b/>
+          <w:sz w:val="22"/>
+        </w:rPr>
+        <w:t>4. Stakeholder Analysis</w:t>
+      </w:r>
+      <w:r>
+        <w:rPr>
+          <w:rFonts w:ascii="Times New Roman" w:hAnsi="Times New Roman"/>
+          <w:b/>
+          <w:sz w:val="22"/>
+        </w:rPr>
+        <w:tab/>
+        <w:t>6</w:t>
+      </w:r>
+    </w:p>
+    <w:p>
+      <w:pPr>
+        <w:tabs>
+          <w:tab w:pos="9026" w:val="right" w:leader="dot"/>
+        </w:tabs>
+        <w:spacing w:line="312" w:lineRule="auto" w:after="120"/>
+      </w:pPr>
+      <w:r>
+        <w:rPr>
+          <w:rFonts w:ascii="Times New Roman" w:hAnsi="Times New Roman"/>
+          <w:b/>
+          <w:sz w:val="22"/>
+        </w:rPr>
+        <w:t>5. Critical Evaluation</w:t>
+      </w:r>
+      <w:r>
+        <w:rPr>
+          <w:rFonts w:ascii="Times New Roman" w:hAnsi="Times New Roman"/>
+          <w:b/>
+          <w:sz w:val="22"/>
+        </w:rPr>
+        <w:tab/>
+        <w:t>8</w:t>
+      </w:r>
+    </w:p>
+    <w:p>
+      <w:pPr>
+        <w:tabs>
+          <w:tab w:pos="9026" w:val="right" w:leader="dot"/>
+        </w:tabs>
+        <w:spacing w:line="312" w:lineRule="auto" w:after="120"/>
+      </w:pPr>
+      <w:r>
+        <w:rPr>
+          <w:rFonts w:ascii="Times New Roman" w:hAnsi="Times New Roman"/>
+          <w:b/>
+          <w:sz w:val="22"/>
+        </w:rPr>
+        <w:t>6. Policy Recommendation</w:t>
+      </w:r>
+      <w:r>
+        <w:rPr>
+          <w:rFonts w:ascii="Times New Roman" w:hAnsi="Times New Roman"/>
+          <w:b/>
+          <w:sz w:val="22"/>
+        </w:rPr>
+        <w:tab/>
+        <w:t>9</w:t>
+      </w:r>
+    </w:p>
+    <w:p>
+      <w:pPr>
+        <w:tabs>
+          <w:tab w:pos="9026" w:val="right" w:leader="dot"/>
+        </w:tabs>
+        <w:spacing w:line="312" w:lineRule="auto" w:after="120"/>
+      </w:pPr>
+      <w:r>
+        <w:rPr>
+          <w:rFonts w:ascii="Times New Roman" w:hAnsi="Times New Roman"/>
+          <w:b/>
+          <w:sz w:val="22"/>
+        </w:rPr>
+        <w:t>7. Conclusion</w:t>
+      </w:r>
+      <w:r>
+        <w:rPr>
+          <w:rFonts w:ascii="Times New Roman" w:hAnsi="Times New Roman"/>
+          <w:b/>
+          <w:sz w:val="22"/>
+        </w:rPr>
+        <w:tab/>
+        <w:t>10</w:t>
+      </w:r>
+    </w:p>
+    <w:p>
+      <w:pPr>
+        <w:tabs>
+          <w:tab w:pos="9026" w:val="right" w:leader="dot"/>
+        </w:tabs>
+        <w:spacing w:line="312" w:lineRule="auto" w:after="120"/>
+      </w:pPr>
+      <w:r>
+        <w:rPr>
+          <w:rFonts w:ascii="Times New Roman" w:hAnsi="Times New Roman"/>
+          <w:b/>
+          <w:sz w:val="22"/>
+        </w:rPr>
+        <w:t>8. References</w:t>
+      </w:r>
+      <w:r>
+        <w:rPr>
+          <w:rFonts w:ascii="Times New Roman" w:hAnsi="Times New Roman"/>
+          <w:b/>
+          <w:sz w:val="22"/>
+        </w:rPr>
+        <w:tab/>
+        <w:t>10</w:t>
+      </w:r>
+    </w:p>
+    <w:p>
+      <w:r>
+        <w:br w:type="page"/>
       </w:r>
     </w:p>
     <w:p>

</xml_diff>